<commit_message>
this is another commit
</commit_message>
<xml_diff>
--- a/a2.docx
+++ b/a2.docx
@@ -14,7 +14,7 @@
           <w:rFonts w:hint="default"/>
           <w:lang w:val="en-US"/>
         </w:rPr>
-        <w:t>Jira is a tool also used for software development tracking.</w:t>
+        <w:t>Jira is a tool also used for software development tracking</w:t>
       </w:r>
       <w:bookmarkStart w:id="0" w:name="_GoBack"/>
       <w:bookmarkEnd w:id="0"/>
@@ -139,7 +139,7 @@
     <w:lsdException w:unhideWhenUsed="0" w:uiPriority="0" w:semiHidden="0" w:name="HTML Code"/>
     <w:lsdException w:unhideWhenUsed="0" w:uiPriority="0" w:semiHidden="0" w:name="HTML Definition"/>
     <w:lsdException w:unhideWhenUsed="0" w:uiPriority="0" w:semiHidden="0" w:name="HTML Keyboard"/>
-    <w:lsdException w:unhideWhenUsed="0" w:uiPriority="0" w:semiHidden="0" w:name="HTML Preformatted"/>
+    <w:lsdException w:qFormat="1" w:unhideWhenUsed="0" w:uiPriority="0" w:semiHidden="0" w:name="HTML Preformatted"/>
     <w:lsdException w:unhideWhenUsed="0" w:uiPriority="0" w:semiHidden="0" w:name="HTML Sample"/>
     <w:lsdException w:unhideWhenUsed="0" w:uiPriority="0" w:semiHidden="0" w:name="HTML Typewriter"/>
     <w:lsdException w:unhideWhenUsed="0" w:uiPriority="0" w:semiHidden="0" w:name="HTML Variable"/>
@@ -320,6 +320,7 @@
   </w:style>
   <w:style w:type="paragraph" w:styleId="4">
     <w:name w:val="HTML Preformatted"/>
+    <w:qFormat/>
     <w:uiPriority w:val="0"/>
     <w:pPr>
       <w:tabs>

</xml_diff>